<commit_message>
Rewrite answers in natural voice
Co-Authored-By: Claude Sonnet 5.5 <noreply@anthropic.com>
Claude-Session: https://claude.ai/code/session_01RkE68saDnqgbsQ7PnnXEWy
</commit_message>
<xml_diff>
--- a/out/Cybersecurity_Ethics_Midterm_Short_Answers.docx
+++ b/out/Cybersecurity_Ethics_Midterm_Short_Answers.docx
@@ -7,7 +7,7 @@
         <w:pStyle w:val="Title"/>
       </w:pPr>
       <w:r>
-        <w:t>Cybersecurity Ethics Midterm: Short Answers</w:t>
+        <w:t>Cybersecurity Ethics Midterm</w:t>
       </w:r>
     </w:p>
     <w:p>
@@ -20,57 +20,17 @@
     </w:p>
     <w:p>
       <w:r>
-        <w:rPr>
-          <w:b/>
-        </w:rPr>
-        <w:t xml:space="preserve">Issues: </w:t>
-      </w:r>
-      <w:r>
-        <w:t>Public safety (water treatment), duty to the employer and client, the vendor's silence, and the less obvious issue that selling to a government contractor means the flaw may be weaponized rather than fixed. Confidentiality owed to the client is also at stake.</w:t>
+        <w:t>I would not sell this flaw. Water treatment plants are about as high-stakes as it gets, and handing the finding to a government contractor means it could end up as a weapon instead of a fix. Selling it also breaks the confidentiality I owe the client whose network I was testing. My manager has authority over my work, but that does not extend to putting a community's drinking water at risk.</w:t>
       </w:r>
     </w:p>
     <w:p>
       <w:r>
-        <w:rPr>
-          <w:b/>
-        </w:rPr>
-        <w:t xml:space="preserve">Frameworks: </w:t>
-      </w:r>
-      <w:r>
-        <w:t>Utilitarianism: full public disclosure with no patch lets attackers act first, while a quiet sale keeps the flaw unfixed. Both risk large harm. Deontology: I have a duty not to treat the public as a means to profit, and the ACM Code requires avoiding harm and putting the public interest first. Virtue ethics: integrity and prudence point to persistent, proportionate action. All three reject the sale.</w:t>
+        <w:t>Looking at it through a few lenses, I get the same answer. As a utilitarian, a quiet sale leaves the hole open for years, and a public dump with no patch hands attackers a head start, so both options risk a lot of harm. From a deontological view, I have a duty not to treat the public as a means to profit, and the ACM Code says to put the public interest first. A virtuous professional would be persistent and careful here, not reckless or greedy. The people affected include plant operators, everyone who drinks the water, the vendor, my firm, and the wider research community that relies on disclosure norms.</w:t>
       </w:r>
     </w:p>
     <w:p>
       <w:r>
-        <w:rPr>
-          <w:b/>
-        </w:rPr>
-        <w:t xml:space="preserve">Stakeholders: </w:t>
-      </w:r>
-      <w:r>
-        <w:t>Water plant operators, the communities they serve (the most vulnerable), the vendor, my employer and client, my colleague and manager, and the security research community whose norms depend on trust.</w:t>
-      </w:r>
-    </w:p>
-    <w:p>
-      <w:r>
-        <w:rPr>
-          <w:b/>
-        </w:rPr>
-        <w:t xml:space="preserve">Decision: </w:t>
-      </w:r>
-      <w:r>
-        <w:t>Refuse the sale. Escalate to the vendor again in writing, then involve a coordinator such as CISA or a national CERT, which can reach plant operators with mitigations. Set a firm deadline and publish only limited technical detail if the vendor still ignores it. The duty to my employer does not extend to endangering the public. If the vendor responded but asked for another year, I would not agree, because ongoing exposure of critical infrastructure outweighs a long delay. I would accept a short, reasonable extension only with active progress and interim mitigations. I am uncertain how likely exploitation is, which is why I favor coordinated steps over immediate full disclosure.</w:t>
-      </w:r>
-    </w:p>
-    <w:p>
-      <w:r>
-        <w:rPr>
-          <w:b/>
-        </w:rPr>
-        <w:t xml:space="preserve">Counterargument: </w:t>
-      </w:r>
-      <w:r>
-        <w:t>Full disclosure advocates say only public pressure forces vendors to act. This is strong, but publishing a water-sector exploit gives attackers a head start. Coordinated pressure keeps leverage while limiting harm.</w:t>
+        <w:t>So I would keep pushing the vendor in writing, then bring in CISA or a national CERT, who can warn plant operators and push for mitigations. If the vendor still ignores everyone after a firm deadline, I would publish limited details, enough to pressure them but not a ready-made exploit. If the vendor had answered and asked for another year, I would say no. A year is too long for critical infrastructure, though I would accept a short extension with real progress and interim fixes. My colleague's argument for full disclosure is the strongest one, since vendors often move only under public pressure. I just think coordinated pressure keeps that leverage without arming attackers. I will admit I cannot know how likely an attack is, and that uncertainty is the reason I lean cautious.</w:t>
       </w:r>
     </w:p>
     <w:p>
@@ -83,57 +43,12 @@
     </w:p>
     <w:p>
       <w:r>
-        <w:rPr>
-          <w:b/>
-        </w:rPr>
-        <w:t xml:space="preserve">Issues: </w:t>
-      </w:r>
-      <w:r>
-        <w:t>Immediate patient safety, funding criminals and encouraging future attacks, legal exposure (sanctions rules, reporting duties), and honesty to patients and the public. A less obvious issue is whether the insurer's coverage distorts the incentive to pay.</w:t>
+        <w:t>My recommendation is not to pay, at least not as the first move. The immediate priority is the two ICU patients. I would work with clinical staff to move them to other hospitals or switch to manual monitoring, and I would restore the most critical systems from backups first instead of treating the week-long restore as all or nothing. I would also bring in the FBI and legal counsel right away.</w:t>
       </w:r>
     </w:p>
     <w:p>
       <w:r>
-        <w:rPr>
-          <w:b/>
-        </w:rPr>
-        <w:t xml:space="preserve">Frameworks: </w:t>
-      </w:r>
-      <w:r>
-        <w:t>Utilitarianism: paying may save two ICU patients now but raises the risk of more attacks on other hospitals. Deontology: I owe duties of care to current patients and honesty to all, and I should not treat any group as expendable. Professional ethics (do no harm) favors protecting life first. Virtue ethics asks for courage and prudence rather than panic.</w:t>
-      </w:r>
-    </w:p>
-    <w:p>
-      <w:r>
-        <w:rPr>
-          <w:b/>
-        </w:rPr>
-        <w:t xml:space="preserve">Stakeholders: </w:t>
-      </w:r>
-      <w:r>
-        <w:t>The two ICU patients and all other patients, clinicians, the community relying on the hospital, future victims of the attackers, regulators, the insurer, and the board and CEO.</w:t>
-      </w:r>
-    </w:p>
-    <w:p>
-      <w:r>
-        <w:rPr>
-          <w:b/>
-        </w:rPr>
-        <w:t xml:space="preserve">Decision: </w:t>
-      </w:r>
-      <w:r>
-        <w:t>I recommend not paying as the default, and acting immediately on patient safety. Move ICU patients to other facilities or run them on manual and paper procedures, begin restoring critical systems first from backups, and engage the FBI. Payment gives no guarantee of working decryption, and a week of restoration is reduced if critical systems are prioritized. If specialists confirmed that the two patients could not be protected any other way, I would escalate to the CEO and counsel and treat payment as a last resort, with legal review of sanctions and full disclosure. Uncertainty remains about the attackers' reliability.</w:t>
-      </w:r>
-    </w:p>
-    <w:p>
-      <w:r>
-        <w:rPr>
-          <w:b/>
-        </w:rPr>
-        <w:t xml:space="preserve">Counterargument: </w:t>
-      </w:r>
-      <w:r>
-        <w:t>The strongest view is that identifiable lives now outweigh statistical future harm. I take it seriously, which is why my plan focuses on diverting patients and prioritizing restoration, so the choice is not forced to a binary.</w:t>
+        <w:t>The pressure to pay is real, and the CEO's instinct comes from a decent place: these are actual people in danger right now. A utilitarian would also point out that paying funds criminals and makes other hospitals more likely targets. From a duty-based view, I owe care to my current patients, but I also owe honesty to the public, and I cannot hide a breach. Payment also carries legal risk if the attackers are on a sanctions list, and nothing guarantees the decryption tool will work. Affected people include the patients, clinicians, the community, future victims, regulators, and even the insurer. If experts told me there was truly no other way to keep those patients safe, I would take it to the CEO and counsel as a last resort, with full disclosure afterward. The strongest counterargument is that known lives now matter more than statistical harm later, and I take that seriously, which is why my plan is built to protect the patients so the choice is not forced.</w:t>
       </w:r>
     </w:p>
     <w:p>
@@ -146,57 +61,12 @@
     </w:p>
     <w:p>
       <w:r>
-        <w:rPr>
-          <w:b/>
-        </w:rPr>
-        <w:t xml:space="preserve">Issues: </w:t>
-      </w:r>
-      <w:r>
-        <w:t>Proxy discrimination through zip codes and women's colleges, harm to applicants who cannot see or contest the scoring, commercial pressure to ship, and "monitor later" as a way to push risk onto the people affected. Legal compliance (anti-discrimination law) is not the same as fairness.</w:t>
+        <w:t>I would not launch it as is. The tool is penalizing women and people from certain zip codes through proxies, and even without race or gender as inputs, that is still discrimination in effect. Saying we will monitor for issues after launch really means applicants will find out the hard way, and most of them will never even know why they were rejected. Following the law is the minimum here, and it is not the same as being fair.</w:t>
       </w:r>
     </w:p>
     <w:p>
       <w:r>
-        <w:rPr>
-          <w:b/>
-        </w:rPr>
-        <w:t xml:space="preserve">Frameworks: </w:t>
-      </w:r>
-      <w:r>
-        <w:t>Deontology: people must be treated as individuals, not by a biased proxy for their group. Utilitarianism: the contract's benefit is smaller than lasting harm to many applicants and the legal and reputational cost to the company. Professional codes (ACM, IEEE) require avoiding harm and being honest about system limits. Virtue ethics: integrity and courage.</w:t>
-      </w:r>
-    </w:p>
-    <w:p>
-      <w:r>
-        <w:rPr>
-          <w:b/>
-        </w:rPr>
-        <w:t xml:space="preserve">Stakeholders: </w:t>
-      </w:r>
-      <w:r>
-        <w:t>Women and applicants from affected zip codes (the most vulnerable, with no voice), the customer, employees at my company, leadership and shareholders, and the public's trust in AI hiring.</w:t>
-      </w:r>
-    </w:p>
-    <w:p>
-      <w:r>
-        <w:rPr>
-          <w:b/>
-        </w:rPr>
-        <w:t xml:space="preserve">Decision: </w:t>
-      </w:r>
-      <w:r>
-        <w:t>I would not launch as is. I would document the findings, propose faster partial fixes (remove proxy features, retrain, add fairness testing), and offer the customer transparency and a staged rollout with human review. Responsibility is shared. Developers and the company designed and sold the tool, and the customer is responsible for how it is used, but the party who knows about the flaw bears the most. If leadership refuses, I would escalate to the ethics or compliance office and legal counsel, and as a last resort consider whistleblowing to a regulator. On replacing human decision-makers: AI can assist, but consequential decisions about people should keep meaningful human oversight and appeal.</w:t>
-      </w:r>
-    </w:p>
-    <w:p>
-      <w:r>
-        <w:rPr>
-          <w:b/>
-        </w:rPr>
-        <w:t xml:space="preserve">Counterargument: </w:t>
-      </w:r>
-      <w:r>
-        <w:t>Leadership argues that biased human recruiters already exist, and monitoring can catch problems. But a known flaw is different from an unknown one, and harm to rejected applicants is largely invisible and cannot be undone.</w:t>
+        <w:t>A duty-based view says people should be judged as individuals, not by a stand-in for their group. A utilitarian view says the contract is worth less than the lasting harm to many applicants plus the legal and reputational fallout. Professional codes like the ACM Code also require avoiding harm and being honest about a system's limits. Responsibility is shared: developers and the company built and sold it, and the customer chooses how to use it, but whoever knows about the flaw carries the most. I would write up the findings, propose quicker partial fixes like removing proxy features and adding fairness tests, and offer the customer a staged rollout with human review. If leadership still refused, I would go to compliance or legal, and as a last resort consider reporting externally. On the class debate, I think AI can help people make hiring decisions but should not fully replace them, because people need someone accountable and a way to appeal. Leadership might say human recruiters are biased too, which is true, but a known flaw we choose to ship is a different thing from one we did not see.</w:t>
       </w:r>
     </w:p>
     <w:p>
@@ -209,57 +79,12 @@
     </w:p>
     <w:p>
       <w:r>
-        <w:rPr>
-          <w:b/>
-        </w:rPr>
-        <w:t xml:space="preserve">Issues: </w:t>
-      </w:r>
-      <w:r>
-        <w:t>Consent and transparency (a vague "may be monitored" notice), proportionality, privacy of personal devices and speech, employee trust, and the legitimate need to protect sensitive defense data.</w:t>
+        <w:t>After a leak, I understand why leadership wants to clamp down, and protecting defense data matters. But I would draw a line. Monitoring company systems and accounts is justified: access logs, data loss prevention, and controls on sensitive files, with a clear written policy that employees actually read and acknowledge. Recording everyone's keystrokes, watching personal devices, and tracking personal social media is not justified, because it reaches into private life well beyond what the job requires.</w:t>
       </w:r>
     </w:p>
     <w:p>
       <w:r>
-        <w:rPr>
-          <w:b/>
-        </w:rPr>
-        <w:t xml:space="preserve">Frameworks: </w:t>
-      </w:r>
-      <w:r>
-        <w:t>Deontology: employees are autonomous persons, and covert, broad surveillance treats them as means. Utilitarianism: targeted monitoring may reduce leaks, but blanket surveillance can damage morale and increase insider risk. Professional codes call for respecting privacy and using only data needed for the purpose. Virtue ethics: trustworthiness and fairness.</w:t>
-      </w:r>
-    </w:p>
-    <w:p>
-      <w:r>
-        <w:rPr>
-          <w:b/>
-        </w:rPr>
-        <w:t xml:space="preserve">Stakeholders: </w:t>
-      </w:r>
-      <w:r>
-        <w:t>All employees, my security team with privacy concerns, leadership, the defense customer and national security interests, and employees' families whose data may be exposed.</w:t>
-      </w:r>
-    </w:p>
-    <w:p>
-      <w:r>
-        <w:rPr>
-          <w:b/>
-        </w:rPr>
-        <w:t xml:space="preserve">Decision: </w:t>
-      </w:r>
-      <w:r>
-        <w:t>I would support monitoring of corporate systems and accounts: logging, data loss prevention, and access controls, with a clear written policy, informed acknowledgment, defined retention, and oversight. I would oppose keystroke capture of everyone, any monitoring of personal devices, and tracking of personal social media, because these are disproportionate and invade private life. Keystroke logging could be used only on specific, documented, approved investigations. Some residual security risk is the cost of respecting dignity, and I accept that trade-off.</w:t>
-      </w:r>
-    </w:p>
-    <w:p>
-      <w:r>
-        <w:rPr>
-          <w:b/>
-        </w:rPr>
-        <w:t xml:space="preserve">Counterargument: </w:t>
-      </w:r>
-      <w:r>
-        <w:t>Leadership says national security justifies maximum monitoring. That has force given a real leak, but intrusive blanket surveillance is likely to be less effective than targeted controls, and it erodes the trust that encourages people to report problems.</w:t>
+        <w:t>From a duty-based view, employees are autonomous people, and a vague notice that activity may be monitored is not real consent. A utilitarian might say more surveillance catches more leaks, but blanket monitoring can wreck morale and make people less willing to report problems, which hurts security. Professional ethics also points to collecting only what is needed for the purpose. The people affected include every employee, my own team who raised concerns, leadership, the defense customer, and family members whose data could get swept up. I would suggest keystroke logging only for specific, approved investigations with a documented reason. Leadership will say national security outweighs privacy, and that has real force given the leak. Still, targeted controls are likely to work better than blanket surveillance, and I accept that a little extra risk is the price of treating people with dignity.</w:t>
       </w:r>
     </w:p>
     <w:p>
@@ -267,62 +92,17 @@
         <w:pStyle w:val="Heading1"/>
       </w:pPr>
       <w:r>
-        <w:t>Question 5: Deepfakes and Autonomous Cyber Defense (option a)</w:t>
+        <w:t>Question 5: Autonomous Cyber Defense (option a)</w:t>
       </w:r>
     </w:p>
     <w:p>
       <w:r>
-        <w:rPr>
-          <w:b/>
-        </w:rPr>
-        <w:t xml:space="preserve">Issues: </w:t>
-      </w:r>
-      <w:r>
-        <w:t>Accountability for machine actions, attribution uncertainty, collateral harm to a hospital, escalation to a nation-state, and the legality of hacking back. A less obvious issue is that speed during an incident creates pressure to remove human judgment.</w:t>
+        <w:t>No, I do not think the AI should be allowed to take offensive action without a human approving it. In this scenario the system cannot tell whether it is hitting a hostile nation-state or a compromised hospital abroad. If it guesses wrong, patients could be harmed and a nation-state could read it as an act of aggression. A machine cannot be held accountable the way a person can, so a named human needs to own that decision.</w:t>
       </w:r>
     </w:p>
     <w:p>
       <w:r>
-        <w:rPr>
-          <w:b/>
-        </w:rPr>
-        <w:t xml:space="preserve">Frameworks: </w:t>
-      </w:r>
-      <w:r>
-        <w:t>Deontology: knowingly risking harm to innocent third parties such as a hospital is unacceptable, and responsibility cannot be delegated to a machine. Utilitarianism: the benefit of faster defense is outweighed by the catastrophic downside of misattribution or escalation. Professional ethics (do no harm, accountability) supports human control. Virtue ethics: prudence and humility about the limits of the system.</w:t>
-      </w:r>
-    </w:p>
-    <w:p>
-      <w:r>
-        <w:rPr>
-          <w:b/>
-        </w:rPr>
-        <w:t xml:space="preserve">Stakeholders: </w:t>
-      </w:r>
-      <w:r>
-        <w:t>The hospital abroad and its patients, my company and its customers, the possible nation-state adversary and the wider public if conflict escalates, and the engineers who build the system.</w:t>
-      </w:r>
-    </w:p>
-    <w:p>
-      <w:r>
-        <w:rPr>
-          <w:b/>
-        </w:rPr>
-        <w:t xml:space="preserve">Decision: </w:t>
-      </w:r>
-      <w:r>
-        <w:t>No, the AI should not take offensive action without a human in the loop. It may detect, contain, and block on our own network autonomously, since that is defensive and reversible. Any action against external infrastructure requires human approval from a named, accountable decision-maker after attribution review and legal advice. Accountability stays with the company and its leaders. I acknowledge that this slows response and that it is hard to know how much.</w:t>
-      </w:r>
-    </w:p>
-    <w:p>
-      <w:r>
-        <w:rPr>
-          <w:b/>
-        </w:rPr>
-        <w:t xml:space="preserve">Counterargument: </w:t>
-      </w:r>
-      <w:r>
-        <w:t>Attackers move at machine speed, and human review may be too slow. I accept this cost for actions that are irreversible and affect third parties. Pre-approved defensive playbooks give speed where the risk is low.</w:t>
+        <w:t>A duty-based view says we cannot knowingly risk innocent third parties, and we cannot hand off responsibility to software. A utilitarian view says speed is nice, but the downside of misattribution or escalation is huge and cannot be undone. Professional codes ask us to avoid harm and stay accountable, and a bit of humility about what the system can actually know. Affected parties include the hospital and its patients, our customers, the possible adversary, the engineers, and the public if tensions rise. My position is that the AI can detect, contain, and block on our own network by itself, since that is defensive and reversible. Anything aimed at outside infrastructure needs approval after attribution review and legal advice. The counterargument is that attackers move at machine speed and human review is slow. That cost is real, and I accept it for irreversible actions that touch third parties, while pre-approved playbooks can keep low-risk responses fast.</w:t>
       </w:r>
     </w:p>
     <w:sectPr>

</xml_diff>

<commit_message>
Expand answers to a full page each
Co-Authored-By: Claude Sonnet 5.5 <noreply@anthropic.com>
Claude-Session: https://claude.ai/code/session_01RkE68saDnqgbsQ7PnnXEWy
</commit_message>
<xml_diff>
--- a/out/Cybersecurity_Ethics_Midterm_Short_Answers.docx
+++ b/out/Cybersecurity_Ethics_Midterm_Short_Answers.docx
@@ -2,14 +2,6 @@
 <file path=word/document.xml><?xml version="1.0" encoding="utf-8"?>
 <w:document xmlns:wpc="http://schemas.microsoft.com/office/word/2010/wordprocessingCanvas" xmlns:mo="http://schemas.microsoft.com/office/mac/office/2008/main" xmlns:mc="http://schemas.openxmlformats.org/markup-compatibility/2006" xmlns:mv="urn:schemas-microsoft-com:mac:vml" xmlns:o="urn:schemas-microsoft-com:office:office" xmlns:r="http://schemas.openxmlformats.org/officeDocument/2006/relationships" xmlns:m="http://schemas.openxmlformats.org/officeDocument/2006/math" xmlns:v="urn:schemas-microsoft-com:vml" xmlns:wp14="http://schemas.microsoft.com/office/word/2010/wordprocessingDrawing" xmlns:wp="http://schemas.openxmlformats.org/drawingml/2006/wordprocessingDrawing" xmlns:w10="urn:schemas-microsoft-com:office:word" xmlns:w="http://schemas.openxmlformats.org/wordprocessingml/2006/main" xmlns:w14="http://schemas.microsoft.com/office/word/2010/wordml" xmlns:wpg="http://schemas.microsoft.com/office/word/2010/wordprocessingGroup" xmlns:wpi="http://schemas.microsoft.com/office/word/2010/wordprocessingInk" xmlns:wne="http://schemas.microsoft.com/office/word/2006/wordml" xmlns:wps="http://schemas.microsoft.com/office/word/2010/wordprocessingShape" mc:Ignorable="w14 wp14">
   <w:body>
-    <w:p>
-      <w:pPr>
-        <w:pStyle w:val="Title"/>
-      </w:pPr>
-      <w:r>
-        <w:t>Cybersecurity Ethics Midterm</w:t>
-      </w:r>
-    </w:p>
     <w:p>
       <w:pPr>
         <w:pStyle w:val="Heading1"/>
@@ -20,22 +12,33 @@
     </w:p>
     <w:p>
       <w:r>
-        <w:t>I would not sell this flaw. Water treatment plants are about as high-stakes as it gets, and handing the finding to a government contractor means it could end up as a weapon instead of a fix. Selling it also breaks the confidentiality I owe the client whose network I was testing. My manager has authority over my work, but that does not extend to putting a community's drinking water at risk.</w:t>
+        <w:t>I would not sell this flaw. Water treatment plants are about as high-stakes as infrastructure gets, and handing the finding to a government contractor means it could end up as a weapon instead of a fix. Selling it would also break the confidentiality I owe the client whose network I was testing, and it would put my own professional reputation on the line. My manager has authority over my work, but that authority does not extend to risking a community's drinking water for a payday. The ethical issues here are public safety, my duty to my employer, the vendor's silence, and the less obvious problem that a quiet sale keeps the flaw unfixed for as long as the buyer wants it that way.</w:t>
       </w:r>
     </w:p>
     <w:p>
       <w:r>
-        <w:t>Looking at it through a few lenses, I get the same answer. As a utilitarian, a quiet sale leaves the hole open for years, and a public dump with no patch hands attackers a head start, so both options risk a lot of harm. From a deontological view, I have a duty not to treat the public as a means to profit, and the ACM Code says to put the public interest first. A virtuous professional would be persistent and careful here, not reckless or greedy. The people affected include plant operators, everyone who drinks the water, the vendor, my firm, and the wider research community that relies on disclosure norms.</w:t>
+        <w:t>Looking at it through several lenses gives me the same answer. As a utilitarian, a quiet sale leaves the hole open for years, and a public dump with no patch hands attackers a head start, so both options risk a great deal of harm. From a deontological view, I have a duty not to treat the public as a means to profit, and the ACM Code of Ethics tells me to put the public interest first and avoid harm. Virtue ethics asks what a person of integrity and practical wisdom would do, and that person would be persistent and careful, neither reckless nor greedy. The frameworks differ on how to weigh outcomes against duties, but they all reject the sale.</w:t>
       </w:r>
     </w:p>
     <w:p>
       <w:r>
-        <w:t>So I would keep pushing the vendor in writing, then bring in CISA or a national CERT, who can warn plant operators and push for mitigations. If the vendor still ignores everyone after a firm deadline, I would publish limited details, enough to pressure them but not a ready-made exploit. If the vendor had answered and asked for another year, I would say no. A year is too long for critical infrastructure, though I would accept a short extension with real progress and interim fixes. My colleague's argument for full disclosure is the strongest one, since vendors often move only under public pressure. I just think coordinated pressure keeps that leverage without arming attackers. I will admit I cannot know how likely an attack is, and that uncertainty is the reason I lean cautious.</w:t>
+        <w:t>The people affected include plant operators, everyone who depends on the water supply (the most vulnerable stakeholders, since they cannot protect themselves), the vendor, my firm and client, my colleague and manager, and the wider research community that relies on trusted disclosure norms.</w:t>
+      </w:r>
+    </w:p>
+    <w:p>
+      <w:r>
+        <w:t>So here is what I would do. I would keep pushing the vendor in writing, then bring in CISA or a national CERT, who can warn plant operators and push for mitigations even without a patch. I would set a firm deadline. If the vendor still ignores everyone, I would publish limited details, enough to create pressure and let operators defend themselves, but not a ready-made exploit. If the vendor had responded and asked for another year, I would say no. A year is far too long for critical infrastructure, though I would accept a short extension if there were real progress and interim workarounds for operators.</w:t>
+      </w:r>
+    </w:p>
+    <w:p>
+      <w:r>
+        <w:t>My colleague's argument for full disclosure is the strongest opposing view, because vendors often move only under public pressure, and silence can be a way of doing nothing. I take that seriously. But coordinated pressure keeps most of that leverage without giving attackers a roadmap. I will admit I cannot know exactly how likely an attack is or how fast operators can patch, and that uncertainty is the main reason I lean toward careful, staged steps over either extreme.</w:t>
       </w:r>
     </w:p>
     <w:p>
       <w:pPr>
         <w:pStyle w:val="Heading1"/>
+        <w:pageBreakBefore/>
       </w:pPr>
       <w:r>
         <w:t>Question 2: Ransomware Payment</w:t>
@@ -43,17 +46,33 @@
     </w:p>
     <w:p>
       <w:r>
-        <w:t>My recommendation is not to pay, at least not as the first move. The immediate priority is the two ICU patients. I would work with clinical staff to move them to other hospitals or switch to manual monitoring, and I would restore the most critical systems from backups first instead of treating the week-long restore as all or nothing. I would also bring in the FBI and legal counsel right away.</w:t>
+        <w:t>My recommendation is not to pay, at least not as the first move. The immediate priority is the two ICU patients. I would work with clinical staff to transfer them to other hospitals or switch to manual monitoring, and I would restore the most critical systems from backups first instead of treating the week-long restore as all or nothing. I would also bring in the FBI and legal counsel right away, and check whether the attackers appear on any sanctions list, since payment could itself be illegal.</w:t>
       </w:r>
     </w:p>
     <w:p>
       <w:r>
-        <w:t>The pressure to pay is real, and the CEO's instinct comes from a decent place: these are actual people in danger right now. A utilitarian would also point out that paying funds criminals and makes other hospitals more likely targets. From a duty-based view, I owe care to my current patients, but I also owe honesty to the public, and I cannot hide a breach. Payment also carries legal risk if the attackers are on a sanctions list, and nothing guarantees the decryption tool will work. Affected people include the patients, clinicians, the community, future victims, regulators, and even the insurer. If experts told me there was truly no other way to keep those patients safe, I would take it to the CEO and counsel as a last resort, with full disclosure afterward. The strongest counterargument is that known lives now matter more than statistical harm later, and I take that seriously, which is why my plan is built to protect the patients so the choice is not forced.</w:t>
+        <w:t>The pressure to pay is real, and the CEO's instinct comes from a decent place, because these are actual people in danger right now. The main ethical issues are patient safety, the precedent set for future attacks, legal and regulatory duties, and honesty with patients and the public. A less obvious issue is that the insurer's offer to cover the cost makes paying feel free, when it really shifts the harm onto future victims.</w:t>
+      </w:r>
+    </w:p>
+    <w:p>
+      <w:r>
+        <w:t>Applying the frameworks, a utilitarian would count the lives at risk now but also note that paying funds criminals and makes hospitals more attractive targets, so the total harm could be larger. Deontology says I owe a duty of care to my current patients, but I also owe honesty to the public and cannot hide a breach or treat other people's future safety as irrelevant. Professional ethics, including the principle of doing no harm, supports putting patient safety first by every means available, not only by paying. Virtue ethics points to courage and prudence rather than panic. Comparing them, utilitarianism and duty of care can pull toward paying, while precedent and legal duties pull the other way, and that tension is why I want a plan that does not force a binary choice.</w:t>
+      </w:r>
+    </w:p>
+    <w:p>
+      <w:r>
+        <w:t>The stakeholders include the two ICU patients and all other patients, clinicians, families, the community that depends on this hospital, future victims of the same attackers, regulators, the insurer, and the CEO and board. Patients are the most vulnerable and have the least say, so they weigh most with me.</w:t>
+      </w:r>
+    </w:p>
+    <w:p>
+      <w:r>
+        <w:t>My decision is to refuse payment while aggressively protecting patients, notify regulators and affected people as the law requires, and be open with the public about what happened and what we are doing. If clinical experts told me there was truly no other way to keep those patients safe, I would take payment to the CEO and counsel as a last resort, with legal review and full disclosure afterward. The strongest counterargument is that identifiable lives now matter more than statistical harm later. I agree that is a hard point, and it is why my plan is built to protect those patients so that the choice is not forced on us. I also admit that paying offers no guarantee the decryption will work.</w:t>
       </w:r>
     </w:p>
     <w:p>
       <w:pPr>
         <w:pStyle w:val="Heading1"/>
+        <w:pageBreakBefore/>
       </w:pPr>
       <w:r>
         <w:t>Question 3: Biased Hiring Algorithm</w:t>
@@ -61,17 +80,33 @@
     </w:p>
     <w:p>
       <w:r>
-        <w:t>I would not launch it as is. The tool is penalizing women and people from certain zip codes through proxies, and even without race or gender as inputs, that is still discrimination in effect. Saying we will monitor for issues after launch really means applicants will find out the hard way, and most of them will never even know why they were rejected. Following the law is the minimum here, and it is not the same as being fair.</w:t>
+        <w:t>I would not launch the tool as it is. The model is penalizing women and people from certain zip codes through proxies, and even though race and gender are not inputs, the effect is still discrimination. Saying we will monitor for issues after launch really means applicants will be harmed first and we will find out later, and most of those applicants will never know why they were rejected. Following the law is the minimum, and it is not the same as being fair. The ethical issues include proxy bias, a lack of transparency and recourse for applicants, commercial pressure that rewards cutting corners, and the larger question of who should make decisions about people.</w:t>
       </w:r>
     </w:p>
     <w:p>
       <w:r>
-        <w:t>A duty-based view says people should be judged as individuals, not by a stand-in for their group. A utilitarian view says the contract is worth less than the lasting harm to many applicants plus the legal and reputational fallout. Professional codes like the ACM Code also require avoiding harm and being honest about a system's limits. Responsibility is shared: developers and the company built and sold it, and the customer chooses how to use it, but whoever knows about the flaw carries the most. I would write up the findings, propose quicker partial fixes like removing proxy features and adding fairness tests, and offer the customer a staged rollout with human review. If leadership still refused, I would go to compliance or legal, and as a last resort consider reporting externally. On the class debate, I think AI can help people make hiring decisions but should not fully replace them, because people need someone accountable and a way to appeal. Leadership might say human recruiters are biased too, which is true, but a known flaw we choose to ship is a different thing from one we did not see.</w:t>
+        <w:t>A duty-based view says people should be judged as individuals on their merits and not by a stand-in for their group, so shipping a known biased screen violates that duty. A utilitarian view says the contract is worth less than the lasting harm to many applicants plus the legal and reputational fallout to the company and the customer. Professional codes like the ACM Code and IEEE standards require avoiding harm, being fair, and being honest about a system's limits. Virtue ethics asks whether I could call myself honest and courageous if I stayed quiet. These frameworks agree on the outcome, though they disagree on why: one stresses rights, another consequences, another character.</w:t>
+      </w:r>
+    </w:p>
+    <w:p>
+      <w:r>
+        <w:t>Those harmed are qualified women and applicants from affected neighborhoods, who are the most vulnerable and have no voice in the process. Others affected include the customer's HR staff, my coworkers, leadership and shareholders, and public trust in AI hiring. Responsibility is shared. Developers and the company built and sold the tool, and the customer chooses how to use it, but whoever knows about the flaw carries the most responsibility to act.</w:t>
+      </w:r>
+    </w:p>
+    <w:p>
+      <w:r>
+        <w:t>My decision is to write up the findings, propose faster partial fixes such as removing proxy features, retraining, and adding fairness testing, and offer the customer a staged rollout with human review of every rejection. If leadership still refused, I would escalate to compliance or legal, and as a last resort consider reporting externally, accepting the personal risk. On the class debate, I think AI can help people make hiring decisions but should not fully replace them, because people need someone accountable and a way to appeal.</w:t>
+      </w:r>
+    </w:p>
+    <w:p>
+      <w:r>
+        <w:t>Leadership's best argument is that human recruiters are biased too and monitoring can catch problems. That is true, but a known flaw that we choose to ship is different from one we did not see, and harm to rejected applicants is mostly invisible and hard to undo. I accept the real cost of a delayed launch and a possible lost contract.</w:t>
       </w:r>
     </w:p>
     <w:p>
       <w:pPr>
         <w:pStyle w:val="Heading1"/>
+        <w:pageBreakBefore/>
       </w:pPr>
       <w:r>
         <w:t>Question 4: Workplace Surveillance and Insider Threat</w:t>
@@ -79,17 +114,33 @@
     </w:p>
     <w:p>
       <w:r>
-        <w:t>After a leak, I understand why leadership wants to clamp down, and protecting defense data matters. But I would draw a line. Monitoring company systems and accounts is justified: access logs, data loss prevention, and controls on sensitive files, with a clear written policy that employees actually read and acknowledge. Recording everyone's keystrokes, watching personal devices, and tracking personal social media is not justified, because it reaches into private life well beyond what the job requires.</w:t>
+        <w:t>After a leak, I understand why leadership wants to clamp down, and protecting defense data really does matter. But I would draw a line between monitoring that fits the security goal and monitoring that does not. The ethical issues are consent, transparency, proportionality, employee privacy and trust, and the less obvious risk that heavy surveillance can create the very insider problem it is meant to prevent.</w:t>
       </w:r>
     </w:p>
     <w:p>
       <w:r>
-        <w:t>From a duty-based view, employees are autonomous people, and a vague notice that activity may be monitored is not real consent. A utilitarian might say more surveillance catches more leaks, but blanket monitoring can wreck morale and make people less willing to report problems, which hurts security. Professional ethics also points to collecting only what is needed for the purpose. The people affected include every employee, my own team who raised concerns, leadership, the defense customer, and family members whose data could get swept up. I would suggest keystroke logging only for specific, approved investigations with a documented reason. Leadership will say national security outweighs privacy, and that has real force given the leak. Still, targeted controls are likely to work better than blanket surveillance, and I accept that a little extra risk is the price of treating people with dignity.</w:t>
+        <w:t>Monitoring company systems and accounts is justified. That includes access logs, data loss prevention, and controls on sensitive files, with a clear written policy that employees actually read and acknowledge. Capturing everyone's keystrokes, watching personal devices on the Wi-Fi, and tracking personal social media is not justified, because it reaches into private life well beyond what the job requires. Telling people only that activity may be monitored is not real consent. It is a notice that hides what actually happens.</w:t>
+      </w:r>
+    </w:p>
+    <w:p>
+      <w:r>
+        <w:t>From a duty-based view, employees are autonomous people who deserve to know what is collected and why, and secret or vague surveillance treats them as objects to manage. A utilitarian might say more surveillance catches more leaks, but blanket monitoring can wreck morale, drive out good people, and make employees less willing to report problems, which can reduce security overall. Professional codes ask us to respect privacy and collect only what is needed for the purpose. Virtue ethics asks whether a trustworthy leader would watch people this way. Weighing them, utilitarianism gives some support to stronger monitoring, while the other frameworks set firm limits on how far it can go.</w:t>
+      </w:r>
+    </w:p>
+    <w:p>
+      <w:r>
+        <w:t>The stakeholders include every employee, my own team who raised concerns, leadership, the defense customer and national security interests, and family members or friends whose messages and data could get swept up. Employees are in a weaker position, since refusing the policy may mean losing their jobs, and those with security clearances may feel they cannot object at all. I would also want my own team's privacy concerns heard, since they understand better than anyone how these tools can be misused.</w:t>
+      </w:r>
+    </w:p>
+    <w:p>
+      <w:r>
+        <w:t>My position is to deploy targeted, transparent monitoring of corporate systems, with a defined purpose, limited retention, access controls on the monitoring data itself, and oversight from legal or an ethics board. Keystroke logging would be allowed only for specific, approved investigations with documented cause. I would refuse to monitor personal devices or social media. Leadership's strongest argument is that national security outweighs privacy, and that has real force given the leak. Still, targeted controls are likely to work better than blanket surveillance, and I accept that a little extra risk is the price of treating people with dignity and keeping their trust. I would also revisit the policy after six months to see whether it is working and whether it can be narrowed, so that surveillance does not quietly grow beyond its original purpose.</w:t>
       </w:r>
     </w:p>
     <w:p>
       <w:pPr>
         <w:pStyle w:val="Heading1"/>
+        <w:pageBreakBefore/>
       </w:pPr>
       <w:r>
         <w:t>Question 5: Autonomous Cyber Defense (option a)</w:t>
@@ -97,12 +148,27 @@
     </w:p>
     <w:p>
       <w:r>
-        <w:t>No, I do not think the AI should be allowed to take offensive action without a human approving it. In this scenario the system cannot tell whether it is hitting a hostile nation-state or a compromised hospital abroad. If it guesses wrong, patients could be harmed and a nation-state could read it as an act of aggression. A machine cannot be held accountable the way a person can, so a named human needs to own that decision.</w:t>
+        <w:t>No, I do not think the AI should be allowed to take offensive action without a human approving it. In this scenario the system cannot tell whether it is hitting a hostile nation-state or a compromised hospital abroad. If it guesses wrong, patients could lose access to care, and a nation-state could read the strike as an act of aggression. The ethical issues are accountability, misattribution, collateral harm, escalation, and how far we can trust a machine's judgment. A less obvious issue is that the pressure of a live incident tempts us to remove humans just when judgment matters most.</w:t>
       </w:r>
     </w:p>
     <w:p>
       <w:r>
-        <w:t>A duty-based view says we cannot knowingly risk innocent third parties, and we cannot hand off responsibility to software. A utilitarian view says speed is nice, but the downside of misattribution or escalation is huge and cannot be undone. Professional codes ask us to avoid harm and stay accountable, and a bit of humility about what the system can actually know. Affected parties include the hospital and its patients, our customers, the possible adversary, the engineers, and the public if tensions rise. My position is that the AI can detect, contain, and block on our own network by itself, since that is defensive and reversible. Anything aimed at outside infrastructure needs approval after attribution review and legal advice. The counterargument is that attackers move at machine speed and human review is slow. That cost is real, and I accept it for irreversible actions that touch third parties, while pre-approved playbooks can keep low-risk responses fast.</w:t>
+        <w:t>Applying the frameworks, a duty-based view says we cannot knowingly risk innocent third parties, such as a hospital, and we cannot hand off moral responsibility to software. Hacking back also raises legal problems, since it may break laws in other countries. A utilitarian view says speed is valuable, but the downside of misattribution or escalation is huge and cannot be undone, so even a small chance of that outcome carries a heavy cost. Professional ethics asks us to avoid harm and stay accountable for what our systems do. Virtue ethics adds humility, which means knowing the limits of what the system can actually know. These views agree that offense without oversight is too dangerous, though a purely consequentialist argument could allow it if accuracy were proven very high.</w:t>
+      </w:r>
+    </w:p>
+    <w:p>
+      <w:r>
+        <w:t>The stakeholders include the hospital abroad and its patients, who are the most vulnerable and have no part in the dispute, our own customers and employees, the possible nation-state adversary, the engineers who built the system, and the public if tensions escalate. If the AI causes harm, the company and its leaders must answer for it. No one can blame the algorithm.</w:t>
+      </w:r>
+    </w:p>
+    <w:p>
+      <w:r>
+        <w:t>My position is that the AI can detect, contain, and block on our own network by itself, since that is defensive and reversible. Anything aimed at outside infrastructure needs approval from a named, accountable person after attribution review and legal advice. In the scenario described, I would have the AI pause, gather evidence, and alert the incident commander instead of striking, and I would contact the hospital's security team or national CERT in case their machines are compromised.</w:t>
+      </w:r>
+    </w:p>
+    <w:p>
+      <w:r>
+        <w:t>The strongest counterargument is that attackers move at machine speed, and human review is slow, so the defender loses the race. I accept that cost for irreversible actions that touch third parties. Pre-approved playbooks for low-risk, reversible responses can keep the system fast where the danger of error is small. I also admit I am unsure how to define the line between defensive and offensive action in every case.</w:t>
       </w:r>
     </w:p>
     <w:sectPr>
@@ -478,6 +544,13 @@
     <w:name w:val="Normal"/>
     <w:qFormat/>
     <w:rsid w:val="00FC693F"/>
+    <w:pPr>
+      <w:spacing w:line="276" w:lineRule="auto" w:after="160"/>
+    </w:pPr>
+    <w:rPr>
+      <w:rFonts w:ascii="Times New Roman" w:hAnsi="Times New Roman"/>
+      <w:sz w:val="24"/>
+    </w:rPr>
   </w:style>
   <w:style w:type="paragraph" w:styleId="Header">
     <w:name w:val="header"/>

</xml_diff>